<commit_message>
Add PowerShell script to deploy Redis with private endpoint and test DNS synchronization in Azure China
- Implemented Test-RedisPrivateEndpointSync.ps1 to create an isolated Azure China environment.
- Supports both Classic and Managed Azure Cache for Redis.
- Validates private endpoint approval, DNS record creation, and synchronization.
- Includes options for resource retention and customizable parameters.
</commit_message>
<xml_diff>
--- a/PWC-Azure-China-Private-DNS-Automation-Guide.docx
+++ b/PWC-Azure-China-Private-DNS-Automation-Guide.docx
@@ -161,7 +161,7 @@
           <w:color w:val="7A3000"/>
           <w:shd w:val="clear" w:color="auto" w:fill="FCEDE5"/>
         </w:rPr>
-        <w:t>Deploy-SyncPrivateEndpointPrivateDnsAutomation.ps1</w:t>
+        <w:t>Deploy-AzureChinaPrivateDnsAutomation.ps1</w:t>
       </w:r>
       <w:r>
         <w:rPr>
@@ -819,7 +819,7 @@
           <w:sz w:val="18"/>
           <w:szCs w:val="18"/>
         </w:rPr>
-        <w:t>.\Deploy-SyncPrivateEndpointPrivateDnsAutomation.ps1 `</w:t>
+        <w:t>.\Deploy-AzureChinaPrivateDnsAutomation.ps1 `</w:t>
       </w:r>
       <w:r>
         <w:rPr>
@@ -1405,7 +1405,7 @@
           <w:sz w:val="18"/>
           <w:szCs w:val="18"/>
         </w:rPr>
-        <w:t>.\Deploy-SyncPrivateEndpointPrivateDnsAutomation.ps1 `</w:t>
+        <w:t>.\Deploy-AzureChinaPrivateDnsAutomation.ps1 `</w:t>
       </w:r>
       <w:r>
         <w:rPr>

</xml_diff>